<commit_message>
Apresentacao: pesos vetorizados + Sharpe por bloco + benchmarks no print
Loop de pesos vira matriz do lider (mesmos numeros, provado na rodada).
Saida ganha 2 linhas: robustez por bloco (2017-19/20-22/23-26) e
benchmarks do periodo (B&H 1/3 e CDI). Pseudocodigo regenerado.

Co-Authored-By: Claude Opus 4.8 <noreply@anthropic.com>
</commit_message>
<xml_diff>
--- a/Pseudocodigo_DualMomentum.docx
+++ b/Pseudocodigo_DualMomentum.docx
@@ -363,42 +363,42 @@
           <w:sz w:val="18"/>
           <w:szCs w:val="18"/>
         </w:rPr>
-        <w:t xml:space="preserve">Começo a matriz de pesos zerada.</w:t>
-      </w:r>
-    </w:p>
-    <w:p>
-      <w:pPr>
-        <w:spacing w:after="40"/>
-      </w:pPr>
-      <w:r>
-        <w:rPr>
-          <w:b/>
-          <w:bCs/>
-          <w:sz w:val="18"/>
-          <w:szCs w:val="18"/>
-        </w:rPr>
-        <w:t xml:space="preserve">34–36 — </w:t>
-      </w:r>
-      <w:r>
-        <w:rPr>
-          <w:sz w:val="18"/>
-          <w:szCs w:val="18"/>
-        </w:rPr>
-        <w:t xml:space="preserve">Para cada mês a partir do 12º: se investe, coloco 100% no líder do mês.</w:t>
-      </w:r>
-    </w:p>
-    <w:p>
-      <w:pPr>
-        <w:spacing w:after="40"/>
-      </w:pPr>
-      <w:r>
-        <w:rPr>
-          <w:b/>
-          <w:bCs/>
-          <w:sz w:val="18"/>
-          <w:szCs w:val="18"/>
-        </w:rPr>
-        <w:t xml:space="preserve">37 — </w:t>
+        <w:t xml:space="preserve">Monto a matriz do líder: 1 na coluna do líder de cada mês, 0 nas outras.</w:t>
+      </w:r>
+    </w:p>
+    <w:p>
+      <w:pPr>
+        <w:spacing w:after="40"/>
+      </w:pPr>
+      <w:r>
+        <w:rPr>
+          <w:b/>
+          <w:bCs/>
+          <w:sz w:val="18"/>
+          <w:szCs w:val="18"/>
+        </w:rPr>
+        <w:t xml:space="preserve">34 — </w:t>
+      </w:r>
+      <w:r>
+        <w:rPr>
+          <w:sz w:val="18"/>
+          <w:szCs w:val="18"/>
+        </w:rPr>
+        <w:t xml:space="preserve">Peso: a matriz do líder vezes a permissão da perna absoluta — 100% no líder, se puder investir.</w:t>
+      </w:r>
+    </w:p>
+    <w:p>
+      <w:pPr>
+        <w:spacing w:after="40"/>
+      </w:pPr>
+      <w:r>
+        <w:rPr>
+          <w:b/>
+          <w:bCs/>
+          <w:sz w:val="18"/>
+          <w:szCs w:val="18"/>
+        </w:rPr>
+        <w:t xml:space="preserve">35 — </w:t>
       </w:r>
       <w:r>
         <w:rPr>
@@ -433,7 +433,7 @@
           <w:sz w:val="18"/>
           <w:szCs w:val="18"/>
         </w:rPr>
-        <w:t xml:space="preserve">40–41 — </w:t>
+        <w:t xml:space="preserve">38–39 — </w:t>
       </w:r>
       <w:r>
         <w:rPr>
@@ -454,6 +454,48 @@
           <w:sz w:val="18"/>
           <w:szCs w:val="18"/>
         </w:rPr>
+        <w:t xml:space="preserve">40 — </w:t>
+      </w:r>
+      <w:r>
+        <w:rPr>
+          <w:sz w:val="18"/>
+          <w:szCs w:val="18"/>
+        </w:rPr>
+        <w:t xml:space="preserve">Acumulo o patrimônio: produto de (1 + retorno).</w:t>
+      </w:r>
+    </w:p>
+    <w:p>
+      <w:pPr>
+        <w:spacing w:after="40"/>
+      </w:pPr>
+      <w:r>
+        <w:rPr>
+          <w:b/>
+          <w:bCs/>
+          <w:sz w:val="18"/>
+          <w:szCs w:val="18"/>
+        </w:rPr>
+        <w:t xml:space="preserve">41 — </w:t>
+      </w:r>
+      <w:r>
+        <w:rPr>
+          <w:sz w:val="18"/>
+          <w:szCs w:val="18"/>
+        </w:rPr>
+        <w:t xml:space="preserve">Calculo o Sharpe: média sobre desvio, anualizado por raiz de 12.</w:t>
+      </w:r>
+    </w:p>
+    <w:p>
+      <w:pPr>
+        <w:spacing w:after="40"/>
+      </w:pPr>
+      <w:r>
+        <w:rPr>
+          <w:b/>
+          <w:bCs/>
+          <w:sz w:val="18"/>
+          <w:szCs w:val="18"/>
+        </w:rPr>
         <w:t xml:space="preserve">42 — </w:t>
       </w:r>
       <w:r>
@@ -461,7 +503,7 @@
           <w:sz w:val="18"/>
           <w:szCs w:val="18"/>
         </w:rPr>
-        <w:t xml:space="preserve">Acumulo o patrimônio: produto de (1 + retorno).</w:t>
+        <w:t xml:space="preserve">Calculo o drawdown máximo: mínimo do patrimônio sobre o seu máximo até ali, menos um.</w:t>
       </w:r>
     </w:p>
     <w:p>
@@ -482,7 +524,7 @@
           <w:sz w:val="18"/>
           <w:szCs w:val="18"/>
         </w:rPr>
-        <w:t xml:space="preserve">Calculo o Sharpe: média sobre desvio, anualizado por raiz de 12.</w:t>
+        <w:t xml:space="preserve">Calculo o retorno total.</w:t>
       </w:r>
     </w:p>
     <w:p>
@@ -503,7 +545,7 @@
           <w:sz w:val="18"/>
           <w:szCs w:val="18"/>
         </w:rPr>
-        <w:t xml:space="preserve">Calculo o drawdown máximo: mínimo do patrimônio sobre o seu máximo até ali, menos um.</w:t>
+        <w:t xml:space="preserve">Meço o tempo em caixa: em quantos % dos meses a carteira ficou 100% no CDI.</w:t>
       </w:r>
     </w:p>
     <w:p>
@@ -524,7 +566,7 @@
           <w:sz w:val="18"/>
           <w:szCs w:val="18"/>
         </w:rPr>
-        <w:t xml:space="preserve">Calculo o retorno total.</w:t>
+        <w:t xml:space="preserve">Conto as trocas de posição.</w:t>
       </w:r>
     </w:p>
     <w:p>
@@ -545,48 +587,6 @@
           <w:sz w:val="18"/>
           <w:szCs w:val="18"/>
         </w:rPr>
-        <w:t xml:space="preserve">Meço o tempo em caixa: em quantos % dos meses a carteira ficou 100% no CDI.</w:t>
-      </w:r>
-    </w:p>
-    <w:p>
-      <w:pPr>
-        <w:spacing w:after="40"/>
-      </w:pPr>
-      <w:r>
-        <w:rPr>
-          <w:b/>
-          <w:bCs/>
-          <w:sz w:val="18"/>
-          <w:szCs w:val="18"/>
-        </w:rPr>
-        <w:t xml:space="preserve">47 — </w:t>
-      </w:r>
-      <w:r>
-        <w:rPr>
-          <w:sz w:val="18"/>
-          <w:szCs w:val="18"/>
-        </w:rPr>
-        <w:t xml:space="preserve">Conto as trocas de posição.</w:t>
-      </w:r>
-    </w:p>
-    <w:p>
-      <w:pPr>
-        <w:spacing w:after="40"/>
-      </w:pPr>
-      <w:r>
-        <w:rPr>
-          <w:b/>
-          <w:bCs/>
-          <w:sz w:val="18"/>
-          <w:szCs w:val="18"/>
-        </w:rPr>
-        <w:t xml:space="preserve">48 — </w:t>
-      </w:r>
-      <w:r>
-        <w:rPr>
-          <w:sz w:val="18"/>
-          <w:szCs w:val="18"/>
-        </w:rPr>
         <w:t xml:space="preserve">Guardo a posição de hoje: o líder atual, ou CAIXA se a perna absoluta mandar sair.</w:t>
       </w:r>
     </w:p>
@@ -601,7 +601,49 @@
           <w:sz w:val="18"/>
           <w:szCs w:val="18"/>
         </w:rPr>
-        <w:t xml:space="preserve">50 — </w:t>
+        <w:t xml:space="preserve">49–52 — </w:t>
+      </w:r>
+      <w:r>
+        <w:rPr>
+          <w:sz w:val="18"/>
+          <w:szCs w:val="18"/>
+        </w:rPr>
+        <w:t xml:space="preserve">Calculo o Sharpe em três blocos de ~3 anos — robustez: a estratégia funciona em cada pedaço do tempo, ou só no agregado?</w:t>
+      </w:r>
+    </w:p>
+    <w:p>
+      <w:pPr>
+        <w:spacing w:after="40"/>
+      </w:pPr>
+      <w:r>
+        <w:rPr>
+          <w:b/>
+          <w:bCs/>
+          <w:sz w:val="18"/>
+          <w:szCs w:val="18"/>
+        </w:rPr>
+        <w:t xml:space="preserve">53–56 — </w:t>
+      </w:r>
+      <w:r>
+        <w:rPr>
+          <w:sz w:val="18"/>
+          <w:szCs w:val="18"/>
+        </w:rPr>
+        <w:t xml:space="preserve">Monto os benchmarks do mesmo período: B&amp;H 1/3 (rebalanceado ao mês) e o CDI acumulado — contexto para o Sharpe.</w:t>
+      </w:r>
+    </w:p>
+    <w:p>
+      <w:pPr>
+        <w:spacing w:after="40"/>
+      </w:pPr>
+      <w:r>
+        <w:rPr>
+          <w:b/>
+          <w:bCs/>
+          <w:sz w:val="18"/>
+          <w:szCs w:val="18"/>
+        </w:rPr>
+        <w:t xml:space="preserve">58 — </w:t>
       </w:r>
       <w:r>
         <w:rPr>
@@ -622,7 +664,7 @@
           <w:sz w:val="18"/>
           <w:szCs w:val="18"/>
         </w:rPr>
-        <w:t xml:space="preserve">51 — </w:t>
+        <w:t xml:space="preserve">59 — </w:t>
       </w:r>
       <w:r>
         <w:rPr>
@@ -643,7 +685,7 @@
           <w:sz w:val="18"/>
           <w:szCs w:val="18"/>
         </w:rPr>
-        <w:t xml:space="preserve">52 — </w:t>
+        <w:t xml:space="preserve">60 — </w:t>
       </w:r>
       <w:r>
         <w:rPr>
@@ -664,7 +706,7 @@
           <w:sz w:val="18"/>
           <w:szCs w:val="18"/>
         </w:rPr>
-        <w:t xml:space="preserve">53 — </w:t>
+        <w:t xml:space="preserve">61 — </w:t>
       </w:r>
       <w:r>
         <w:rPr>
@@ -672,6 +714,48 @@
           <w:szCs w:val="18"/>
         </w:rPr>
         <w:t xml:space="preserve">Imprimo o tempo em caixa, as trocas e a posição de hoje.</w:t>
+      </w:r>
+    </w:p>
+    <w:p>
+      <w:pPr>
+        <w:spacing w:after="40"/>
+      </w:pPr>
+      <w:r>
+        <w:rPr>
+          <w:b/>
+          <w:bCs/>
+          <w:sz w:val="18"/>
+          <w:szCs w:val="18"/>
+        </w:rPr>
+        <w:t xml:space="preserve">62 — </w:t>
+      </w:r>
+      <w:r>
+        <w:rPr>
+          <w:sz w:val="18"/>
+          <w:szCs w:val="18"/>
+        </w:rPr>
+        <w:t xml:space="preserve">Imprimo o Sharpe por bloco.</w:t>
+      </w:r>
+    </w:p>
+    <w:p>
+      <w:pPr>
+        <w:spacing w:after="40"/>
+      </w:pPr>
+      <w:r>
+        <w:rPr>
+          <w:b/>
+          <w:bCs/>
+          <w:sz w:val="18"/>
+          <w:szCs w:val="18"/>
+        </w:rPr>
+        <w:t xml:space="preserve">63 — </w:t>
+      </w:r>
+      <w:r>
+        <w:rPr>
+          <w:sz w:val="18"/>
+          <w:szCs w:val="18"/>
+        </w:rPr>
+        <w:t xml:space="preserve">Imprimo os benchmarks do período.</w:t>
       </w:r>
     </w:p>
     <w:sectPr>

</xml_diff>